<commit_message>
Revise ch5-6: ledger infiltration, Grandmaster speech trim, canon and language fixes
- Ch5: replace elevator-shaft stunt with in-character procedural vault infiltration; compress opening decision matrix; cut recap ending and final aphorism; fix double UNDER REVIEW flip and exit contradiction
- Ch6: fix Minor->Miner Town; trim recap sentence and re-labeling list from Grandmaster speech in both Tamil and English; reduce 'as though' six to one; replace abstract-noun cascade; make Clan-vs-gana intentional founders' usage
- Ch11: fix pledge word count (seven -> eight words)
- Tracker: log native Tamil/Sanskrit verification as open item
</commit_message>
<xml_diff>
--- a/manuscript/chapter-05-the-altered-record.docx
+++ b/manuscript/chapter-05-the-altered-record.docx
@@ -26,17 +26,7 @@
     </w:p>
     <w:p>
       <w:r>
-        <w:t>Elara stood before her console, watching the executive escalation order seal itself into Trinity’s central ledger. In Drona, every crisis was an equation waiting for an operator to balance it, but as she evaluated her remaining options, she knew the math offered no safe resolution.</w:t>
-      </w:r>
-    </w:p>
-    <w:p>
-      <w:r>
-        <w:t>Compliance was the quiet, cautious choice. Her operator status was already flagged as UNDER REVIEW on the monitoring board—she was already backed into a corner, her every input scrutinized by Drona evaluators and her peers. If she did nothing, she wouldn't clear her profile, but she wouldn't push her precarious position over a cliff. She could absorb the administrative reprimand, let the system process Gage, Ben, and Otto through standard culling protocols, and keep what remained of her career intact. To remain passive was to protect herself in a corner, but it meant becoming an accomplice to the very machinery that had erased Teresa.</w:t>
-      </w:r>
-    </w:p>
-    <w:p>
-      <w:r>
-        <w:t>An official administrative appeal offered no real alternative. She could lodge a formal dissent through Drona’s governance channels, but bureaucracy in Trinity was designed to exhaust resistance through delay. By the time her petition reached a review board, the boys’ separation directives would already be enforced, and her name would simply be flagged for secondary audit.</w:t>
+        <w:t>Elara stood before her console, watching the executive escalation order seal itself into Trinity’s central ledger. Her operator status was already flagged as UNDER REVIEW, every input scrutinized by Drona evaluators and her peers. She could absorb the reprimand, let the system process Gage, Ben, and Otto through standard culling protocols, and keep what remained of her career. She could file a formal dissent and watch it drown in committees while the separation directives executed. Both roads ended in the same place: her record intact, and the machinery that had erased Teresa running exactly as designed.</w:t>
       </w:r>
     </w:p>
     <w:p>
@@ -46,12 +36,7 @@
     </w:p>
     <w:p>
       <w:r>
-        <w:t>Yet sitting back while the system dismantled the boys was a line she refused to walk again. That left only a desperate third option: direct, unauthorized intervention.</w:t>
-      </w:r>
-    </w:p>
-    <w:p>
-      <w:r>
-        <w:t>Altering a protected governance document inside the restricted archives was an act of high treason. In her already compromised position, any further slip would escalate an administrative review into immediate, permanent catastrophe. If she failed—or if the system traced the biometric footprint of her override—there would be no second chance. She would lose her clearance, her freedom, and her place in Trinity, facing permanent containment or exile to the ground she had once tried so desperately to reach. But as she watched the three linked signals pulsing on her screen, Elara knew that safety bought through inaction was no safety at all.</w:t>
+        <w:t>That left direct, unauthorized intervention. Altering a protected governance document was high treason; if the system traced her override, she would lose her clearance, her freedom, and her place in Trinity — permanent containment, or exile to the ground she had once tried so desperately to reach. But as she watched the three linked signals pulsing on her screen, Elara knew that safety bought through inaction was no safety at all.</w:t>
       </w:r>
     </w:p>
     <w:p>
@@ -71,37 +56,17 @@
     </w:p>
     <w:p>
       <w:r>
-        <w:t>With her twenty-minute clock ticking on the main board, Elara stepped away from the console with deliberate, unhurried precision. She walked past the curved monitoring desks, her pulse held steady against the room's biometric sensors, and entered the nearest Skylark before the doors closed. The elevator began its descent toward the administrative tiers. Elara waited until the pod had gathered speed, then knelt beside the maintenance panel and used the metal tip of her hairpin to loosen the exhaust-vent screws.</w:t>
+        <w:t>With her twenty-minute clock ticking on the main board, Elara stepped away from the console with deliberate, unhurried precision. She walked past the curved monitoring desks, her pulse held steady against the room's biometric sensors, and entered the nearest Skylark before the doors closed. The pod descended toward the sub-tier vaults, and she used the thirty seconds to rehearse the route the way she had once rehearsed incident reports: every checkpoint her authorization covered, and the one door it did not.</w:t>
       </w:r>
     </w:p>
     <w:p>
       <w:r>
-        <w:t>Removing the vent grill exposed the secondary access latch designed for emergency shaft maintenance. Elara disengaged the ceiling locks, pushing the hinged hatch panel upward into the dark, vertical corridor. Using the interior handrails for leverage, she hoisted her torso into the howling wind above the car, pulling herself flat onto the vibrating roof.</w:t>
+        <w:t>The vault level smelled of paper and machine oil. A duty clerk glanced at her audit code, logged her entry, and returned to his queue. Elara signed the vault register in her own name — the cover only held if the audit was real — and began pulling the hard-copy ledgers her review required, stacking the folios in the retrieval crate while the clock in her head kept subtracting.</w:t>
       </w:r>
     </w:p>
     <w:p>
       <w:r>
-        <w:t>The pod was dropping too fast to risk a direct leap to the wall; the downward velocity would tear her fingers from the rungs the moment she touched them. Crouching on the oil-slicked metal, she tracked the vertical steel guide-rail running beside the car. As the pod sped past a mid-shaft maintenance junction, the gap between the car roof and the wall ladder briefly compressed to a mere foot.</w:t>
-      </w:r>
-    </w:p>
-    <w:p>
-      <w:r>
-        <w:t>Elara timed her move to the split-second. She lunged for the ladder's vertical steel upright, wrapping her forearm around the bar and absorbing the violent downward jerk against the rung braces. The pod dropped away beneath her boots with a deafening rush of displacement wind, leaving her suspended in the dark shaft, knees locked against the wall, her knuckles white as she fought the momentum trying to throw her into the void.</w:t>
-      </w:r>
-    </w:p>
-    <w:p>
-      <w:r>
-        <w:t>The shaft wind tore at her uniform and filled her ears with the roar of the city moving through its own machinery. She gripped the cables and climbed, one hand above the other, while the elevator continued racing toward the ground floor.</w:t>
-      </w:r>
-    </w:p>
-    <w:p>
-      <w:r>
-        <w:t>The restricted archive lay between the governance tiers, accessible only through a service cavity that the public maps did not show. Elara reached the upper landing and swung toward the wall recess just as the Skylark rose beneath her on its return cycle. The pod shot past within inches of her boots, its exterior running lights sweeping over her face. She folded herself into the cavity and held her breath until the cab ascended past and the lights vanished above into the upper shaft.</w:t>
-      </w:r>
-    </w:p>
-    <w:p>
-      <w:r>
-        <w:t>The wall opened behind a maintenance plate. Elara crawled into the archive corridor and found the superintendent's office sealed but unattended. The restricted archive didn't rely on physical locks; it required an active administrative session token, an encrypted key generated anew with each monitoring cycle.</w:t>
+        <w:t>The restricted archive adjoined the vaults through the superintendents' corridor, one tier of clearance beyond hers. Her audit authorization opened the corridor. It would not open the archive, and it would log her pulse at every door sensor she passed. She walked the corridor at retrieval pace, folios in her arms, and found the superintendent's office sealed but unattended. The restricted archive didn't rely on physical locks; it required an active administrative session token, an encrypted key generated anew with each monitoring cycle.</w:t>
       </w:r>
     </w:p>
     <w:p>
@@ -131,22 +96,22 @@
     </w:p>
     <w:p>
       <w:r>
-        <w:t>The record sealed itself. For the moment, the three boys would enter Sector One without special instructions marking them for separation. It was not freedom. It was not justice. It was three ordinary doors left open in a system that had already decided to close them.</w:t>
+        <w:t>The record sealed itself. For the moment, the three boys would enter Sector One without special instructions marking them for separation. It was three ordinary doors left open in a system that had already decided to close them.</w:t>
       </w:r>
     </w:p>
     <w:p>
       <w:r>
-        <w:t>Elara deleted the temporary access trail, replaced the terminal cover, and climbed back into the service cavity. When she reached the Skylark shaft, the next pod was already rising.</w:t>
+        <w:t>Elara deleted the temporary access trail and stepped back into the corridor. Halfway down, an archivist on rounds turned the corner toward her. She kept walking at retrieval pace, the folios of her cover story in plain view across her arms, and made herself the most boring thing in his evening. He nodded and passed. The door sensor at the vault end took her pulse and found it acceptable.</w:t>
       </w:r>
     </w:p>
     <w:p>
       <w:r>
-        <w:t>She waited for the carriage to pass, then dropped onto its roof.</w:t>
+        <w:t>She rode the Skylark up with four minutes left on the audit clock.</w:t>
       </w:r>
     </w:p>
     <w:p>
       <w:r>
-        <w:t>By the time she stepped back into the monitoring room, the executive review notice was still glowing on her console. Ravi looked at her once. His eyes moved to the loosened hairpin in her hand, then to the archive confirmation fading from the corner of her display.</w:t>
+        <w:t>By the time she stepped back into the monitoring room, the executive review notice was still glowing on her console. Ravi looked at her once. His eyes moved to the retrieved audit folios under her arm, then to the archive confirmation fading from the corner of her display.</w:t>
       </w:r>
     </w:p>
     <w:p>
@@ -161,7 +126,7 @@
     </w:p>
     <w:p>
       <w:r>
-        <w:t>The alert remained active on Elara's console. Her operator status changed from AUTHORIZED to UNDER REVIEW.</w:t>
+        <w:t>The alert remained active on Elara's console, her operator status still locked at UNDER REVIEW.</w:t>
       </w:r>
     </w:p>
     <w:p>
@@ -306,22 +271,7 @@
     </w:p>
     <w:p>
       <w:r>
-        <w:t>None of them was wrong. They had fought for every breath, resisted the chamber's chemistry, stopped one another from breaking, and walked out under their own power. Their survival belonged to them. Trinity had always intended for candidates to emerge from the Initiation; what it had not intended was for three of them to emerge together, still loyal to one another and capable of resisting the system's interpretation. The threat was not that they had survived. It was that they had survived without becoming separate, obedient workers.</w:t>
-      </w:r>
-    </w:p>
-    <w:p>
-      <w:r>
-        <w:t>What they did not know was that even this outcome had nearly been taken from them. Without Elara, the system would have separated them before the gates reopened, classified their mutual protection as a threat, and sent the force ladder to finish what the chamber had started. Their victory was real because they had earned it. Elara's intervention ensured Trinity could not redefine it before they reached the gates.</w:t>
-      </w:r>
-    </w:p>
-    <w:p>
-      <w:r>
-        <w:t>While they had been fighting in the dark, Elara had kept the separation order from becoming an extraction. She had preserved their cohesion in the report, challenged the system's interpretation, endured Daren's sabotage and accusation, and risked her clearance to alter the induction record before the executive review could turn their survival into three separate punishments. She had not won the Initiation for them. She had made it possible for their own victory to remain theirs.</w:t>
-      </w:r>
-    </w:p>
-    <w:p>
-      <w:r>
-        <w:t>They did not know that she had left their connection visible when the system demanded three separate entries. They walked toward the mine gates carrying the bright, private certainty of a victory they believed was entirely their own, and they were right to carry it. Elara had not taken that victory from them. She had paid the hidden cost of keeping it intact.</w:t>
+        <w:t>None of them was wrong. Their survival belonged to them. Trinity had always intended for candidates to emerge from the Initiation. It had not intended for three of them to emerge together.</w:t>
       </w:r>
     </w:p>
     <w:p>
@@ -332,11 +282,6 @@
     <w:p>
       <w:r>
         <w:t>Below, three boys stepped out of the mine and into the beginning of whatever came after survival. Above, the woman who had kept them together stood alone before a locked door, listening to the system decide what her intervention would cost.</w:t>
-      </w:r>
-    </w:p>
-    <w:p>
-      <w:r>
-        <w:t>The saved carried the wounds they could see. The one who saved them would carry the scars no one else would ever be able to name.</w:t>
       </w:r>
     </w:p>
     <w:sectPr>

</xml_diff>

<commit_message>
Ch5 author-review round 2: ledger-verification right, terminal-crack expansion, strikethrough record diff (+script support), session cleanup, Ravi/Daren/scar/discipline/ending fixes, Otto triad
</commit_message>
<xml_diff>
--- a/manuscript/chapter-05-the-altered-record.docx
+++ b/manuscript/chapter-05-the-altered-record.docx
@@ -55,12 +55,12 @@
     </w:p>
     <w:p>
       <w:r>
-        <w:t>The review flag itself gave her the opening. Elara initiated Drona’s mandatory audit protocol — the provision that activated the moment an operator’s status was flagged for review — and selected the option for physical ledger verification, a procedural requirement that allowed her twenty minutes to retrieve hard-copy archive documentation from the sub-tier vaults before executive lockouts took effect. On the room’s central display, her console status shifted from active monitoring to TEMPORARY TRANSIT: AUDIT RETRIEVAL.</w:t>
+        <w:t>The review flag itself gave her the opening. Every operator under review held one procedural right before the inquiry convened: physical ledger verification — twenty minutes in the sub-tier vaults to pull the printed shift ledgers, the paper record of every decision she had entered, and check them against the digital ledger the review board would read. It was the bureaucracy's version of letting the accused see the evidence. Elara initiated Drona's mandatory audit protocol and selected the option before executive lockouts could take effect. On the room's central display, her console status shifted from active monitoring to TEMPORARY TRANSIT: AUDIT RETRIEVAL.</w:t>
       </w:r>
     </w:p>
     <w:p>
       <w:r>
-        <w:t>Daren glanced up, a faint, smug smirk playing at the corner of his mouth; he assumed she was scurrying off to prepare her defense for the upcoming inquiry. Ravi watched her log the code without expression, satisfied that she was following protocol. Rohan merely nodded once, acknowledging her compliance with system procedures.</w:t>
+        <w:t>Daren glanced up, a faint, smug smirk playing at the corner of his mouth; he assumed she was scurrying off to prepare her defense for the upcoming inquiry. Ravi watched the retrieval authorization post to the central display without expression, satisfied that she was following protocol. Rohan merely nodded once, acknowledging her compliance with system procedures.</w:t>
       </w:r>
     </w:p>
     <w:p>
@@ -75,7 +75,12 @@
     </w:p>
     <w:p>
       <w:r>
-        <w:t>The restricted archive adjoined the vaults through the superintendents' corridor, one tier of clearance beyond hers. Her audit authorization opened the corridor. It would not open the archive, and it would log her pulse at every door sensor she passed. She walked the corridor at retrieval pace, folios in her arms, and found the superintendent's office sealed but unattended. The restricted archive didn't rely on physical locks; it required an active administrative session token, an encrypted key generated anew with each monitoring cycle.</w:t>
+        <w:t>The restricted archive lay one tier of clearance beyond hers, joined to the vaults by a single connecting corridor. Her audit authorization opened the corridor. It did not open the archive. And every door sensor she passed logged her pulse along the way.</w:t>
+      </w:r>
+    </w:p>
+    <w:p>
+      <w:r>
+        <w:t>She walked at retrieval pace, folios in her arms. The archive had no physical lock to pick. It answered only to an administrative session token — an encrypted key generated fresh with each monitoring cycle, issued from the superintendent's duty terminal. That terminal stood in its alcove at the end of the corridor, outside the sealed office, running and unattended.</w:t>
       </w:r>
     </w:p>
     <w:p>
@@ -85,17 +90,45 @@
     </w:p>
     <w:p>
       <w:r>
-        <w:t>Elara ran the terminal’s diagnostic routine, substituting the report reference for the supervisor’s key to clear the secondary verification gate. The administrative portal opened.</w:t>
+        <w:t>Elara set the folios on the alcove shelf and opened the terminal's reconciliation routine — the housekeeping mode superintendents used to verify paper ledgers against their digital copies. She knew the routine from the inside. The records position Trinity had once buried her in had been built from exactly this work, and years of it had taught her the system's one lazy habit: reconciliation required an administrative session, and rather than wait for a superintendent, the routine would mint the session token itself whenever the request arrived under a valid audit reference. The superintendent's key existed to prove a request was legitimate. So did an active audit flag — and hers was glowing on the central ledger at that very moment.</w:t>
       </w:r>
     </w:p>
     <w:p>
       <w:r>
-        <w:t>She located the cohort assignment file and made a single, precise edit:</w:t>
+        <w:t>She entered her audit reference in the credential field and waited through three seconds that felt like a shift. The terminal checked the flag against the central ledger, found the paperwork in perfect order, and accepted its own bureaucracy as proof. The administrative portal opened.</w:t>
       </w:r>
     </w:p>
     <w:p>
       <w:r>
-        <w:t>GAGE. BEN. OTTO. MINER TOWN SECTOR ONE INDUCTION: STANDARD COHORT. DEVIATION ESCALATION: WITHHELD PENDING EXECUTIVE REVIEW.</w:t>
+        <w:t>The system had been built to distrust people. It had never learned to distrust itself.</w:t>
+      </w:r>
+    </w:p>
+    <w:p>
+      <w:r>
+        <w:t>She located the cohort assignment file. It took her seconds to find the two fields that would decide the boys' lives, and one careful minute to change them. The terminal displayed the edit the way ledgers always did — the old entry struck through beside the new:</w:t>
+      </w:r>
+    </w:p>
+    <w:p>
+      <w:r>
+        <w:t xml:space="preserve">GAGE. BEN. OTTO. MINER TOWN SECTOR ONE INDUCTION: </w:t>
+      </w:r>
+      <w:r>
+        <w:rPr>
+          <w:strike/>
+        </w:rPr>
+        <w:t>COORDINATED DEVIATION CLUSTER</w:t>
+      </w:r>
+      <w:r>
+        <w:t xml:space="preserve"> STANDARD COHORT. DEVIATION ESCALATION: </w:t>
+      </w:r>
+      <w:r>
+        <w:rPr>
+          <w:strike/>
+        </w:rPr>
+        <w:t>ACTIVE — SEPARATION DIRECTIVES PENDING</w:t>
+      </w:r>
+      <w:r>
+        <w:t xml:space="preserve"> WITHHELD PENDING EXECUTIVE REVIEW.</w:t>
       </w:r>
     </w:p>
     <w:p>
@@ -110,7 +143,7 @@
     </w:p>
     <w:p>
       <w:r>
-        <w:t>Elara deleted the temporary access trail and stepped back into the corridor. Halfway down, an archivist on rounds turned the corner toward her. She kept walking at retrieval pace, the folios of her cover story in plain view across her arms, and made herself the most boring thing in his evening. He nodded and passed. The door sensor at the vault end took her pulse and found it acceptable.</w:t>
+        <w:t>Elara closed the reconciliation session, and the terminal cleaned up after itself the way housekeeping routines always did: the self-minted token expired, and the session's working log purged with it. The door sensors and the vault register were beyond her reach — those records would keep what they kept. She stepped back into the corridor. Halfway down, an archivist on rounds turned the corner toward her. She kept walking at retrieval pace, the folios of her cover story in plain view across her arms, and made herself the most boring thing in his evening. He nodded and passed. The door sensor at the vault end took her pulse and found it acceptable.</w:t>
       </w:r>
     </w:p>
     <w:p>
@@ -125,7 +158,7 @@
     </w:p>
     <w:p>
       <w:r>
-        <w:t>He did not ask where she had been.</w:t>
+        <w:t>He did not need to ask where she had been. That was what worried her.</w:t>
       </w:r>
     </w:p>
     <w:p>
@@ -195,7 +228,7 @@
     </w:p>
     <w:p>
       <w:r>
-        <w:t>"You meddled with the process," Daren continued. "You fed the system interpretations it had already rejected and called them observations. You pushed those candidates into a pattern they were never meant to occupy, and you did it for a reason I cannot name yet." He pushed himself upright, the chair rolling back behind him. "Being the lead does not give you the right to rewrite the work. It does not give you the right to decide which rules apply to you."</w:t>
+        <w:t>"You meddled with the process," Daren continued. "You fed the system interpretations it had already rejected and called them observations. Those candidates formed a pattern they were never meant to occupy — and every time the system moved to break it, you were standing in the way. And you did it for a reason I cannot name yet." He pushed himself upright, the chair rolling back behind him. "Being the lead does not give you the right to rewrite the work. It does not give you the right to decide which rules apply to you."</w:t>
       </w:r>
     </w:p>
     <w:p>
@@ -240,7 +273,7 @@
     </w:p>
     <w:p>
       <w:r>
-        <w:t>Before Elara could understand what he meant, or what the promise might cost him, Rohan turned and walked away. For the first time, the constant blue light caught the scar along his face. It did not look like a scar then. It glinted like blue steel, less a mark of injury than a piece of armor he had carried so long it had become part of him.</w:t>
+        <w:t>Before Elara could understand what he meant, or what the promise might cost him, Rohan turned and walked away. As he passed beneath the corridor lights, the constant blue glow caught the scar along his jaw. It did not look like a scar then. It glinted like blue steel, less a mark of injury than a piece of armor he had carried so long it had become part of him.</w:t>
       </w:r>
     </w:p>
     <w:p>
@@ -255,7 +288,7 @@
     </w:p>
     <w:p>
       <w:r>
-        <w:t>She walked beneath the blue corridor lights with her hands empty and her mind crowded by alarms. Behind her, the monitoring room continued recording the three linked signals. Ahead, her quarters waited with their sealed door and its small, indifferent reader. The system had returned her body to her. It had not returned her certainty.</w:t>
+        <w:t>She walked beneath the blue corridor lights with her hands empty and her mind crowded by alarms. Behind her, the monitoring room continued recording the three linked signals. Ahead, her quarters waited with their sealed door and its small, indifferent reader. The system had returned her body to her. The discipline she had carried into the monitoring room three days ago — observe first, report second, feel last — had not come back with it.</w:t>
       </w:r>
     </w:p>
     <w:p>
@@ -275,7 +308,7 @@
     </w:p>
     <w:p>
       <w:r>
-        <w:t>No monitor announced their survival. No report translated the shape they made between them. Gage believed they had beaten the chamber through force and endurance. Ben believed they had kept the part of one another that Trinity wanted to remove. Otto said nothing, his face turned toward the open gates and the pale strip of sky beyond them.</w:t>
+        <w:t>No monitor announced their survival. No report translated the shape they made between them. Gage believed they had beaten the chamber through force and endurance. Ben believed they had kept the part of one another that Trinity wanted to remove. Otto believed nothing he had words for; his face was turned toward the open gates and the pale strip of sky beyond them.</w:t>
       </w:r>
     </w:p>
     <w:p>
@@ -285,12 +318,12 @@
     </w:p>
     <w:p>
       <w:r>
-        <w:t>Elara reached her quarters at the same moment. Her hand closed around the door handle, but she did not turn it. In the polished metal, her reflection appeared in fragments: one eye, the edge of her mouth, the blue light cutting her face into planes that did not quite belong to her.</w:t>
+        <w:t>Elara reached her quarters at the same moment. Her hand closed around the door handle, but she did not turn it yet. In the polished metal, her reflection appeared in fragments: one eye, the edge of her mouth, the blue light cutting her face into planes that did not quite belong to her.</w:t>
       </w:r>
     </w:p>
     <w:p>
       <w:r>
-        <w:t>Below, three boys stepped out of the mine and into the beginning of whatever came after survival. Above, the woman who had kept them together stood alone before a locked door, listening to the system decide what her intervention would cost.</w:t>
+        <w:t>Below, three boys stepped out of the mine and into the beginning of whatever came after survival. Above, the woman who had kept them together stood alone at her own threshold — before a door that would still open for her, for now — listening to the system decide what her intervention would cost.</w:t>
       </w:r>
     </w:p>
     <w:sectPr>

</xml_diff>